<commit_message>
Add pipeline overview for presentation, pipeline diagram, full-floor rerun support
Co-Authored-By: Claude Sonnet 5.5 <noreply@anthropic.com>
Claude-Session: https://claude.ai/code/session_01Tm2YrptvV5UNdA6T6XQsRW
</commit_message>
<xml_diff>
--- a/AARON/evaluation/paper/paper.docx
+++ b/AARON/evaluation/paper/paper.docx
@@ -22942,7 +22942,7 @@
               <w:jc w:val="left"/>
             </w:pPr>
             <w:r>
-              <w:t xml:space="preserve">–</w:t>
+              <w:t xml:space="preserve">1,797</w:t>
             </w:r>
           </w:p>
         </w:tc>
@@ -22966,7 +22966,7 @@
               <w:jc w:val="left"/>
             </w:pPr>
             <w:r>
-              <w:t xml:space="preserve">–</w:t>
+              <w:t xml:space="preserve">54×</w:t>
             </w:r>
           </w:p>
         </w:tc>
@@ -23040,7 +23040,7 @@
               <w:jc w:val="left"/>
             </w:pPr>
             <w:r>
-              <w:t xml:space="preserve">–</w:t>
+              <w:t xml:space="preserve">5,913</w:t>
             </w:r>
           </w:p>
         </w:tc>
@@ -23064,7 +23064,7 @@
               <w:jc w:val="left"/>
             </w:pPr>
             <w:r>
-              <w:t xml:space="preserve">–</w:t>
+              <w:t xml:space="preserve">34×</w:t>
             </w:r>
           </w:p>
         </w:tc>
@@ -23138,7 +23138,7 @@
               <w:jc w:val="left"/>
             </w:pPr>
             <w:r>
-              <w:t xml:space="preserve">–</w:t>
+              <w:t xml:space="preserve">37,665</w:t>
             </w:r>
           </w:p>
         </w:tc>
@@ -23162,7 +23162,7 @@
               <w:jc w:val="left"/>
             </w:pPr>
             <w:r>
-              <w:t xml:space="preserve">–</w:t>
+              <w:t xml:space="preserve">216×</w:t>
             </w:r>
           </w:p>
         </w:tc>
@@ -25779,7 +25779,7 @@
         </m:r>
       </m:oMath>
       <w:r>
-        <w:t xml:space="preserve">; † marks rows where the floor design search found no feasible design within the reduced search space used here and the legacy</w:t>
+        <w:t xml:space="preserve">; † marks rows where even the full floor design search found no feasible design and the legacy</w:t>
       </w:r>
       <w:r>
         <w:t xml:space="preserve"> </w:t>
@@ -25794,7 +25794,57 @@
         <w:t xml:space="preserve"> </w:t>
       </w:r>
       <w:r>
-        <w:t xml:space="preserve">design was used, so these are not comparable):</w:t>
+        <w:t xml:space="preserve">design was used, so these are not comparable; rows that were rerun with the full search settings (6 leakage fractions,</w:t>
+      </w:r>
+      <w:r>
+        <w:t xml:space="preserve"> </w:t>
+      </w:r>
+      <m:oMath>
+        <m:r>
+          <m:t>m</m:t>
+        </m:r>
+        <m:r>
+          <m:rPr>
+            <m:sty m:val="p"/>
+          </m:rPr>
+          <m:t>∈</m:t>
+        </m:r>
+        <m:r>
+          <m:rPr>
+            <m:sty m:val="p"/>
+          </m:rPr>
+          <m:t>{</m:t>
+        </m:r>
+        <m:r>
+          <m:t>4</m:t>
+        </m:r>
+        <m:r>
+          <m:rPr>
+            <m:sty m:val="p"/>
+          </m:rPr>
+          <m:t>,</m:t>
+        </m:r>
+        <m:r>
+          <m:t>6</m:t>
+        </m:r>
+        <m:r>
+          <m:rPr>
+            <m:sty m:val="p"/>
+          </m:rPr>
+          <m:t>,</m:t>
+        </m:r>
+        <m:r>
+          <m:t>8</m:t>
+        </m:r>
+        <m:r>
+          <m:rPr>
+            <m:sty m:val="p"/>
+          </m:rPr>
+          <m:t>}</m:t>
+        </m:r>
+      </m:oMath>
+      <w:r>
+        <w:t xml:space="preserve">) are listed with those results):</w:t>
       </w:r>
     </w:p>
     <w:tbl>
@@ -28201,6 +28251,372 @@
             </w:pPr>
             <w:r>
               <w:t xml:space="preserve">728×</w:t>
+            </w:r>
+          </w:p>
+        </w:tc>
+      </w:tr>
+      <w:tr>
+        <w:tc>
+          <w:tcPr/>
+          <w:p>
+            <w:pPr>
+              <w:pStyle w:val="Compact"/>
+              <w:jc w:val="left"/>
+            </w:pPr>
+            <w:r>
+              <w:t xml:space="preserve">12</w:t>
+            </w:r>
+          </w:p>
+        </w:tc>
+        <w:tc>
+          <w:tcPr/>
+          <w:p>
+            <w:pPr>
+              <w:pStyle w:val="Compact"/>
+              <w:jc w:val="left"/>
+            </w:pPr>
+            <w:r>
+              <w:t xml:space="preserve">0.4</w:t>
+            </w:r>
+          </w:p>
+        </w:tc>
+        <w:tc>
+          <w:tcPr/>
+          <w:p>
+            <w:pPr>
+              <w:pStyle w:val="Compact"/>
+              <w:jc w:val="left"/>
+            </w:pPr>
+            <w:r>
+              <w:t xml:space="preserve">0.1</w:t>
+            </w:r>
+          </w:p>
+        </w:tc>
+        <w:tc>
+          <w:tcPr/>
+          <w:p>
+            <w:pPr>
+              <w:pStyle w:val="Compact"/>
+              <w:jc w:val="left"/>
+            </w:pPr>
+            <w:r>
+              <w:t xml:space="preserve">12</w:t>
+            </w:r>
+          </w:p>
+        </w:tc>
+        <w:tc>
+          <w:tcPr/>
+          <w:p>
+            <w:pPr>
+              <w:pStyle w:val="Compact"/>
+              <w:jc w:val="left"/>
+            </w:pPr>
+            <w:r>
+              <w:t xml:space="preserve">1,797</w:t>
+            </w:r>
+          </w:p>
+        </w:tc>
+        <w:tc>
+          <w:tcPr/>
+          <w:p>
+            <w:pPr>
+              <w:pStyle w:val="Compact"/>
+              <w:jc w:val="left"/>
+            </w:pPr>
+            <w:r>
+              <w:t xml:space="preserve">0.023</w:t>
+            </w:r>
+          </w:p>
+        </w:tc>
+        <w:tc>
+          <w:tcPr/>
+          <w:p>
+            <w:pPr>
+              <w:pStyle w:val="Compact"/>
+              <w:jc w:val="left"/>
+            </w:pPr>
+            <w:r>
+              <w:t xml:space="preserve">0.67</w:t>
+            </w:r>
+          </w:p>
+        </w:tc>
+        <w:tc>
+          <w:tcPr/>
+          <w:p>
+            <w:pPr>
+              <w:pStyle w:val="Compact"/>
+              <w:jc w:val="left"/>
+            </w:pPr>
+            <w:r>
+              <w:t xml:space="preserve">9 / 1,356</w:t>
+            </w:r>
+          </w:p>
+        </w:tc>
+        <w:tc>
+          <w:tcPr/>
+          <w:p>
+            <w:pPr>
+              <w:pStyle w:val="Compact"/>
+              <w:jc w:val="left"/>
+            </w:pPr>
+            <w:r>
+              <w:t xml:space="preserve">1979 / 290,946</w:t>
+            </w:r>
+          </w:p>
+        </w:tc>
+        <w:tc>
+          <w:tcPr/>
+          <w:p>
+            <w:pPr>
+              <w:pStyle w:val="Compact"/>
+              <w:jc w:val="left"/>
+            </w:pPr>
+            <w:r>
+              <w:t xml:space="preserve">162×</w:t>
+            </w:r>
+          </w:p>
+        </w:tc>
+      </w:tr>
+      <w:tr>
+        <w:tc>
+          <w:tcPr/>
+          <w:p>
+            <w:pPr>
+              <w:pStyle w:val="Compact"/>
+              <w:jc w:val="left"/>
+            </w:pPr>
+            <w:r>
+              <w:t xml:space="preserve">12</w:t>
+            </w:r>
+          </w:p>
+        </w:tc>
+        <w:tc>
+          <w:tcPr/>
+          <w:p>
+            <w:pPr>
+              <w:pStyle w:val="Compact"/>
+              <w:jc w:val="left"/>
+            </w:pPr>
+            <w:r>
+              <w:t xml:space="preserve">0.4</w:t>
+            </w:r>
+          </w:p>
+        </w:tc>
+        <w:tc>
+          <w:tcPr/>
+          <w:p>
+            <w:pPr>
+              <w:pStyle w:val="Compact"/>
+              <w:jc w:val="left"/>
+            </w:pPr>
+            <w:r>
+              <w:t xml:space="preserve">0.01</w:t>
+            </w:r>
+          </w:p>
+        </w:tc>
+        <w:tc>
+          <w:tcPr/>
+          <w:p>
+            <w:pPr>
+              <w:pStyle w:val="Compact"/>
+              <w:jc w:val="left"/>
+            </w:pPr>
+            <w:r>
+              <w:t xml:space="preserve">40</w:t>
+            </w:r>
+          </w:p>
+        </w:tc>
+        <w:tc>
+          <w:tcPr/>
+          <w:p>
+            <w:pPr>
+              <w:pStyle w:val="Compact"/>
+              <w:jc w:val="left"/>
+            </w:pPr>
+            <w:r>
+              <w:t xml:space="preserve">5,913</w:t>
+            </w:r>
+          </w:p>
+        </w:tc>
+        <w:tc>
+          <w:tcPr/>
+          <w:p>
+            <w:pPr>
+              <w:pStyle w:val="Compact"/>
+              <w:jc w:val="left"/>
+            </w:pPr>
+            <w:r>
+              <w:t xml:space="preserve">0.0064</w:t>
+            </w:r>
+          </w:p>
+        </w:tc>
+        <w:tc>
+          <w:tcPr/>
+          <w:p>
+            <w:pPr>
+              <w:pStyle w:val="Compact"/>
+              <w:jc w:val="left"/>
+            </w:pPr>
+            <w:r>
+              <w:t xml:space="preserve">0.53</w:t>
+            </w:r>
+          </w:p>
+        </w:tc>
+        <w:tc>
+          <w:tcPr/>
+          <w:p>
+            <w:pPr>
+              <w:pStyle w:val="Compact"/>
+              <w:jc w:val="left"/>
+            </w:pPr>
+            <w:r>
+              <w:t xml:space="preserve">35 / 5,178</w:t>
+            </w:r>
+          </w:p>
+        </w:tc>
+        <w:tc>
+          <w:tcPr/>
+          <w:p>
+            <w:pPr>
+              <w:pStyle w:val="Compact"/>
+              <w:jc w:val="left"/>
+            </w:pPr>
+            <w:r>
+              <w:t xml:space="preserve">18004 / 2,646,621</w:t>
+            </w:r>
+          </w:p>
+        </w:tc>
+        <w:tc>
+          <w:tcPr/>
+          <w:p>
+            <w:pPr>
+              <w:pStyle w:val="Compact"/>
+              <w:jc w:val="left"/>
+            </w:pPr>
+            <w:r>
+              <w:t xml:space="preserve">448×</w:t>
+            </w:r>
+          </w:p>
+        </w:tc>
+      </w:tr>
+      <w:tr>
+        <w:tc>
+          <w:tcPr/>
+          <w:p>
+            <w:pPr>
+              <w:pStyle w:val="Compact"/>
+              <w:jc w:val="left"/>
+            </w:pPr>
+            <w:r>
+              <w:t xml:space="preserve">12</w:t>
+            </w:r>
+          </w:p>
+        </w:tc>
+        <w:tc>
+          <w:tcPr/>
+          <w:p>
+            <w:pPr>
+              <w:pStyle w:val="Compact"/>
+              <w:jc w:val="left"/>
+            </w:pPr>
+            <w:r>
+              <w:t xml:space="preserve">0.4</w:t>
+            </w:r>
+          </w:p>
+        </w:tc>
+        <w:tc>
+          <w:tcPr/>
+          <w:p>
+            <w:pPr>
+              <w:pStyle w:val="Compact"/>
+              <w:jc w:val="left"/>
+            </w:pPr>
+            <w:r>
+              <w:t xml:space="preserve">0.001</w:t>
+            </w:r>
+          </w:p>
+        </w:tc>
+        <w:tc>
+          <w:tcPr/>
+          <w:p>
+            <w:pPr>
+              <w:pStyle w:val="Compact"/>
+              <w:jc w:val="left"/>
+            </w:pPr>
+            <w:r>
+              <w:t xml:space="preserve">256</w:t>
+            </w:r>
+          </w:p>
+        </w:tc>
+        <w:tc>
+          <w:tcPr/>
+          <w:p>
+            <w:pPr>
+              <w:pStyle w:val="Compact"/>
+              <w:jc w:val="left"/>
+            </w:pPr>
+            <w:r>
+              <w:t xml:space="preserve">37,665</w:t>
+            </w:r>
+          </w:p>
+        </w:tc>
+        <w:tc>
+          <w:tcPr/>
+          <w:p>
+            <w:pPr>
+              <w:pStyle w:val="Compact"/>
+              <w:jc w:val="left"/>
+            </w:pPr>
+            <w:r>
+              <w:t xml:space="preserve">0.00035</w:t>
+            </w:r>
+          </w:p>
+        </w:tc>
+        <w:tc>
+          <w:tcPr/>
+          <w:p>
+            <w:pPr>
+              <w:pStyle w:val="Compact"/>
+              <w:jc w:val="left"/>
+            </w:pPr>
+            <w:r>
+              <w:t xml:space="preserve">0.82</w:t>
+            </w:r>
+          </w:p>
+        </w:tc>
+        <w:tc>
+          <w:tcPr/>
+          <w:p>
+            <w:pPr>
+              <w:pStyle w:val="Compact"/>
+              <w:jc w:val="left"/>
+            </w:pPr>
+            <w:r>
+              <w:t xml:space="preserve">122 / 17,967</w:t>
+            </w:r>
+          </w:p>
+        </w:tc>
+        <w:tc>
+          <w:tcPr/>
+          <w:p>
+            <w:pPr>
+              <w:pStyle w:val="Compact"/>
+              <w:jc w:val="left"/>
+            </w:pPr>
+            <w:r>
+              <w:t xml:space="preserve">175985 / 25,869,828</w:t>
+            </w:r>
+          </w:p>
+        </w:tc>
+        <w:tc>
+          <w:tcPr/>
+          <w:p>
+            <w:pPr>
+              <w:pStyle w:val="Compact"/>
+              <w:jc w:val="left"/>
+            </w:pPr>
+            <w:r>
+              <w:t xml:space="preserve">687×</w:t>
             </w:r>
           </w:p>
         </w:tc>

</xml_diff>